<commit_message>
Export: keep the observation table and its photo on the same page
Single-photo reports printed the table on one page and the photo on the next,
because the template had no keep-together between them. Add cantSplit to the
observation table's rows and keepNext to its paragraphs, so Word/LibreOffice
moves the table and its following photo to the next page together instead of
splitting them. Validated the edited template stays well-formed and re-parses.

Co-Authored-By: Claude Opus 4.8 <noreply@anthropic.com>
</commit_message>
<xml_diff>
--- a/templates/reena-all-template.docx
+++ b/templates/reena-all-template.docx
@@ -302,6 +302,7 @@
       </w:tblGrid>
       <w:tr>
         <w:trPr>
+          <w:cantSplit/>
           <w:tblHeader/>
         </w:trPr>
         <w:tc>
@@ -324,6 +325,7 @@
           </w:tcPr>
           <w:p>
             <w:pPr>
+              <w:keepNext/>
               <w:spacing w:before="0" w:after="0"/>
               <w:jc w:val="center"/>
             </w:pPr>
@@ -360,6 +362,7 @@
           </w:tcPr>
           <w:p>
             <w:pPr>
+              <w:keepNext/>
               <w:spacing w:before="0" w:after="0"/>
               <w:jc w:val="center"/>
             </w:pPr>
@@ -396,6 +399,7 @@
           </w:tcPr>
           <w:p>
             <w:pPr>
+              <w:keepNext/>
               <w:spacing w:before="0" w:after="0"/>
               <w:jc w:val="center"/>
             </w:pPr>
@@ -432,6 +436,7 @@
           </w:tcPr>
           <w:p>
             <w:pPr>
+              <w:keepNext/>
               <w:spacing w:before="0" w:after="0"/>
               <w:jc w:val="center"/>
             </w:pPr>
@@ -468,6 +473,7 @@
           </w:tcPr>
           <w:p>
             <w:pPr>
+              <w:keepNext/>
               <w:spacing w:before="0" w:after="0"/>
               <w:jc w:val="center"/>
             </w:pPr>
@@ -504,6 +510,7 @@
           </w:tcPr>
           <w:p>
             <w:pPr>
+              <w:keepNext/>
               <w:spacing w:before="0" w:after="0"/>
               <w:jc w:val="center"/>
             </w:pPr>
@@ -523,6 +530,7 @@
       </w:tr>
       <w:tr>
         <w:trPr>
+          <w:cantSplit/>
           <w:trHeight w:val="2850" w:hRule="atLeast"/>
         </w:trPr>
         <w:tc>
@@ -545,6 +553,7 @@
           </w:tcPr>
           <w:p>
             <w:pPr>
+              <w:keepNext/>
               <w:spacing w:before="28" w:after="28" w:line="300"/>
               <w:jc w:val="left"/>
             </w:pPr>
@@ -562,6 +571,7 @@
           </w:p>
           <w:p>
             <w:pPr>
+              <w:keepNext/>
               <w:spacing w:before="28" w:after="28" w:line="300"/>
               <w:jc w:val="left"/>
             </w:pPr>
@@ -598,6 +608,7 @@
           </w:tcPr>
           <w:p>
             <w:pPr>
+              <w:keepNext/>
               <w:spacing w:before="28" w:after="28" w:line="300"/>
               <w:jc w:val="center"/>
             </w:pPr>
@@ -634,6 +645,7 @@
           </w:tcPr>
           <w:p>
             <w:pPr>
+              <w:keepNext/>
               <w:spacing w:before="28" w:after="28" w:line="300"/>
               <w:jc w:val="left"/>
             </w:pPr>
@@ -670,6 +682,7 @@
           </w:tcPr>
           <w:p>
             <w:pPr>
+              <w:keepNext/>
               <w:spacing w:before="0" w:after="0" w:line="240" w:lineRule="auto"/>
               <w:jc w:val="center"/>
             </w:pPr>
@@ -683,6 +696,7 @@
           </w:p>
           <w:p>
             <w:pPr>
+              <w:keepNext/>
               <w:spacing w:before="0" w:after="0" w:line="240" w:lineRule="auto"/>
               <w:jc w:val="center"/>
             </w:pPr>
@@ -696,6 +710,7 @@
           </w:p>
           <w:p>
             <w:pPr>
+              <w:keepNext/>
               <w:spacing w:before="0" w:after="0" w:line="240" w:lineRule="auto"/>
               <w:jc w:val="center"/>
             </w:pPr>
@@ -709,6 +724,7 @@
           </w:p>
           <w:p>
             <w:pPr>
+              <w:keepNext/>
               <w:spacing w:before="28" w:after="28" w:line="320"/>
               <w:jc w:val="center"/>
             </w:pPr>
@@ -745,6 +761,7 @@
           </w:tcPr>
           <w:p>
             <w:pPr>
+              <w:keepNext/>
               <w:spacing w:before="28" w:after="28" w:line="320"/>
               <w:jc w:val="left"/>
             </w:pPr>
@@ -781,6 +798,7 @@
           </w:tcPr>
           <w:p>
             <w:pPr>
+              <w:keepNext/>
               <w:spacing w:before="28" w:after="28" w:line="320"/>
               <w:jc w:val="left"/>
             </w:pPr>

</xml_diff>